<commit_message>
chore: final repository cleanup - keep core assets and submission docs
</commit_message>
<xml_diff>
--- a/submission.docx
+++ b/submission.docx
@@ -1542,111 +1542,7 @@
           <w:sz-cs w:val="24"/>
           <w:spacing w:val="0"/>
         </w:rPr>
-        <w:t xml:space="preserve">#### 2. Technical Observations</w:t>
-      </w:r>
-    </w:p>
-    <w:p>
-      <w:pPr/>
-      <w:r>
-        <w:rPr>
-          <w:rFonts w:ascii="Times" w:hAnsi="Times" w:cs="Times"/>
-          <w:sz w:val="24"/>
-          <w:sz-cs w:val="24"/>
-          <w:b/>
-          <w:spacing w:val="0"/>
-        </w:rPr>
-        <w:t xml:space="preserve">Top Performer</w:t>
-      </w:r>
-      <w:r>
-        <w:rPr>
-          <w:rFonts w:ascii="Times" w:hAnsi="Times" w:cs="Times"/>
-          <w:sz w:val="24"/>
-          <w:sz-cs w:val="24"/>
-          <w:spacing w:val="0"/>
-        </w:rPr>
-        <w:t xml:space="preserve">: </w:t>
-      </w:r>
-      <w:r>
-        <w:rPr>
-          <w:rFonts w:ascii="Times" w:hAnsi="Times" w:cs="Times"/>
-          <w:sz w:val="24"/>
-          <w:sz-cs w:val="24"/>
-          <w:b/>
-          <w:spacing w:val="0"/>
-        </w:rPr>
-        <w:t xml:space="preserve">XGBoost</w:t>
-      </w:r>
-      <w:r>
-        <w:rPr>
-          <w:rFonts w:ascii="Times" w:hAnsi="Times" w:cs="Times"/>
-          <w:sz w:val="24"/>
-          <w:sz-cs w:val="24"/>
-          <w:spacing w:val="0"/>
-        </w:rPr>
-        <w:t xml:space="preserve"> (87.45%) sequentially minimizes errors, making it highly effective for these hardware feature correlations.</w:t>
-      </w:r>
-    </w:p>
-    <w:p>
-      <w:pPr/>
-      <w:r>
-        <w:rPr>
-          <w:rFonts w:ascii="Times" w:hAnsi="Times" w:cs="Times"/>
-          <w:sz w:val="24"/>
-          <w:sz-cs w:val="24"/>
-          <w:b/>
-          <w:spacing w:val="0"/>
-        </w:rPr>
-        <w:t xml:space="preserve">Robustness</w:t>
-      </w:r>
-      <w:r>
-        <w:rPr>
-          <w:rFonts w:ascii="Times" w:hAnsi="Times" w:cs="Times"/>
-          <w:sz w:val="24"/>
-          <w:sz-cs w:val="24"/>
-          <w:spacing w:val="0"/>
-        </w:rPr>
-        <w:t xml:space="preserve">: </w:t>
-      </w:r>
-      <w:r>
-        <w:rPr>
-          <w:rFonts w:ascii="Times" w:hAnsi="Times" w:cs="Times"/>
-          <w:sz w:val="24"/>
-          <w:sz-cs w:val="24"/>
-          <w:b/>
-          <w:spacing w:val="0"/>
-        </w:rPr>
-        <w:t xml:space="preserve">Random Forest</w:t>
-      </w:r>
-      <w:r>
-        <w:rPr>
-          <w:rFonts w:ascii="Times" w:hAnsi="Times" w:cs="Times"/>
-          <w:sz w:val="24"/>
-          <w:sz-cs w:val="24"/>
-          <w:spacing w:val="0"/>
-        </w:rPr>
-        <w:t xml:space="preserve"> (84.71%) provides strong generalization through its bagging technique.</w:t>
-      </w:r>
-    </w:p>
-    <w:p>
-      <w:pPr/>
-      <w:r>
-        <w:rPr>
-          <w:rFonts w:ascii="Times" w:hAnsi="Times" w:cs="Times"/>
-          <w:sz w:val="24"/>
-          <w:sz-cs w:val="24"/>
-          <w:b/>
-          <w:spacing w:val="0"/>
-        </w:rPr>
-        <w:t xml:space="preserve">Linearity</w:t>
-      </w:r>
-      <w:r>
-        <w:rPr>
-          <w:rFonts w:ascii="Times" w:hAnsi="Times" w:cs="Times"/>
-          <w:sz w:val="24"/>
-          <w:sz-cs w:val="24"/>
-          <w:spacing w:val="0"/>
-        </w:rPr>
-        <w:t xml:space="preserve">: </w:t>
+        <w:t xml:space="preserve">#### 2. Observation Table ML Model Name Observation about model performance :-------------- :------------------------------------ </w:t>
       </w:r>
       <w:r>
         <w:rPr>
@@ -1665,29 +1561,45 @@
           <w:sz-cs w:val="24"/>
           <w:spacing w:val="0"/>
         </w:rPr>
-        <w:t xml:space="preserve"> (80.78%) shows that hardware specs have a strong linear relationship with price buckets.</w:t>
-      </w:r>
-    </w:p>
-    <w:p>
-      <w:pPr/>
-      <w:r>
-        <w:rPr>
-          <w:rFonts w:ascii="Times" w:hAnsi="Times" w:cs="Times"/>
-          <w:sz w:val="24"/>
-          <w:sz-cs w:val="24"/>
-          <w:b/>
-          <w:spacing w:val="0"/>
-        </w:rPr>
-        <w:t xml:space="preserve">Constraint</w:t>
-      </w:r>
-      <w:r>
-        <w:rPr>
-          <w:rFonts w:ascii="Times" w:hAnsi="Times" w:cs="Times"/>
-          <w:sz w:val="24"/>
-          <w:sz-cs w:val="24"/>
-          <w:spacing w:val="0"/>
-        </w:rPr>
-        <w:t xml:space="preserve">: </w:t>
+        <w:t xml:space="preserve"> Provides a strong baseline. Efficiently identifies linear relationships in hardware specs. </w:t>
+      </w:r>
+      <w:r>
+        <w:rPr>
+          <w:rFonts w:ascii="Times" w:hAnsi="Times" w:cs="Times"/>
+          <w:sz w:val="24"/>
+          <w:sz-cs w:val="24"/>
+          <w:b/>
+          <w:spacing w:val="0"/>
+        </w:rPr>
+        <w:t xml:space="preserve">Decision Tree</w:t>
+      </w:r>
+      <w:r>
+        <w:rPr>
+          <w:rFonts w:ascii="Times" w:hAnsi="Times" w:cs="Times"/>
+          <w:sz w:val="24"/>
+          <w:sz-cs w:val="24"/>
+          <w:spacing w:val="0"/>
+        </w:rPr>
+        <w:t xml:space="preserve"> Interpretable but less stable; accuracy is comparable to baseline methods. </w:t>
+      </w:r>
+      <w:r>
+        <w:rPr>
+          <w:rFonts w:ascii="Times" w:hAnsi="Times" w:cs="Times"/>
+          <w:sz w:val="24"/>
+          <w:sz-cs w:val="24"/>
+          <w:b/>
+          <w:spacing w:val="0"/>
+        </w:rPr>
+        <w:t xml:space="preserve">kNN</w:t>
+      </w:r>
+      <w:r>
+        <w:rPr>
+          <w:rFonts w:ascii="Times" w:hAnsi="Times" w:cs="Times"/>
+          <w:sz w:val="24"/>
+          <w:sz-cs w:val="24"/>
+          <w:spacing w:val="0"/>
+        </w:rPr>
+        <w:t xml:space="preserve"> Effective at local pattern matching based on similar laptop configurations. </w:t>
       </w:r>
       <w:r>
         <w:rPr>
@@ -1706,21 +1618,64 @@
           <w:sz-cs w:val="24"/>
           <w:spacing w:val="0"/>
         </w:rPr>
-        <w:t xml:space="preserve"> (51.37%) fails to capture the dependencies between components (e.g., RAM and GPU tier).</w:t>
-      </w:r>
-    </w:p>
-    <w:p>
-      <w:pPr>
-        <w:spacing w:after="240"/>
-      </w:pPr>
-      <w:r>
-        <w:rPr>
-          <w:rFonts w:ascii="Times" w:hAnsi="Times" w:cs="Times"/>
-          <w:sz w:val="24"/>
-          <w:sz-cs w:val="24"/>
-          <w:spacing w:val="0"/>
-        </w:rPr>
-        <w:t xml:space="preserve"/>
+        <w:t xml:space="preserve"> Weakest performer; the independence assumption is violated by correlated features like RAM and CPU brand. </w:t>
+      </w:r>
+      <w:r>
+        <w:rPr>
+          <w:rFonts w:ascii="Times" w:hAnsi="Times" w:cs="Times"/>
+          <w:sz w:val="24"/>
+          <w:sz-cs w:val="24"/>
+          <w:b/>
+          <w:spacing w:val="0"/>
+        </w:rPr>
+        <w:t xml:space="preserve">Random Forest (Ensemble)</w:t>
+      </w:r>
+      <w:r>
+        <w:rPr>
+          <w:rFonts w:ascii="Times" w:hAnsi="Times" w:cs="Times"/>
+          <w:sz w:val="24"/>
+          <w:sz-cs w:val="24"/>
+          <w:spacing w:val="0"/>
+        </w:rPr>
+        <w:t xml:space="preserve"> Significant boost in stability and accuracy using the bagging technique. </w:t>
+      </w:r>
+      <w:r>
+        <w:rPr>
+          <w:rFonts w:ascii="Times" w:hAnsi="Times" w:cs="Times"/>
+          <w:sz w:val="24"/>
+          <w:sz-cs w:val="24"/>
+          <w:b/>
+          <w:spacing w:val="0"/>
+        </w:rPr>
+        <w:t xml:space="preserve">XGBoost (Ensemble)</w:t>
+      </w:r>
+      <w:r>
+        <w:rPr>
+          <w:rFonts w:ascii="Times" w:hAnsi="Times" w:cs="Times"/>
+          <w:sz w:val="24"/>
+          <w:sz-cs w:val="24"/>
+          <w:spacing w:val="0"/>
+        </w:rPr>
+        <w:t xml:space="preserve"> </w:t>
+      </w:r>
+      <w:r>
+        <w:rPr>
+          <w:rFonts w:ascii="Times" w:hAnsi="Times" w:cs="Times"/>
+          <w:sz w:val="24"/>
+          <w:sz-cs w:val="24"/>
+          <w:b/>
+          <w:spacing w:val="0"/>
+        </w:rPr>
+        <w:t xml:space="preserve">Top performer</w:t>
+      </w:r>
+      <w:r>
+        <w:rPr>
+          <w:rFonts w:ascii="Times" w:hAnsi="Times" w:cs="Times"/>
+          <w:sz w:val="24"/>
+          <w:sz-cs w:val="24"/>
+          <w:spacing w:val="0"/>
+        </w:rPr>
+        <w:t xml:space="preserve"> (87.5% Accuracy); gradient boosting effectively minimizes residual errors.</w:t>
       </w:r>
     </w:p>
     <w:p>
@@ -1813,6 +1768,28 @@
           <w:spacing w:val="0"/>
         </w:rPr>
         <w:t xml:space="preserve">: Batch prediction support for test data files.</w:t>
+      </w:r>
+    </w:p>
+    <w:p>
+      <w:pPr/>
+      <w:r>
+        <w:rPr>
+          <w:rFonts w:ascii="Times" w:hAnsi="Times" w:cs="Times"/>
+          <w:sz w:val="24"/>
+          <w:sz-cs w:val="24"/>
+          <w:b/>
+          <w:spacing w:val="0"/>
+        </w:rPr>
+        <w:t xml:space="preserve">Sample Test Data</w:t>
+      </w:r>
+      <w:r>
+        <w:rPr>
+          <w:rFonts w:ascii="Times" w:hAnsi="Times" w:cs="Times"/>
+          <w:sz w:val="24"/>
+          <w:sz-cs w:val="24"/>
+          <w:spacing w:val="0"/>
+        </w:rPr>
+        <w:t xml:space="preserve">: Ready-to-use sample CSV download for easy evaluation.</w:t>
       </w:r>
     </w:p>
     <w:p>

</xml_diff>